<commit_message>
Update project title to: Beyond the Words - A Probabilistic and Bayesian Approach to SMS Spam Detection
</commit_message>
<xml_diff>
--- a/BAMAT207_Probabilistic_SMS_Spam_Detection_Full_Academic_Report.docx
+++ b/BAMAT207_Probabilistic_SMS_Spam_Detection_Full_Academic_Report.docx
@@ -24,9 +24,9 @@
           <w:color w:val="1F4E79"/>
           <w:sz w:val="44"/>
         </w:rPr>
-        <w:t>Can a Few Probabilities Catch Spam?</w:t>
+        <w:t>Beyond the Words:</w:t>
         <w:br/>
-        <w:t>Probabilistic SMS Spam Detection</w:t>
+        <w:t>A Probabilistic and Bayesian Approach to SMS Spam Detection</w:t>
       </w:r>
     </w:p>
     <w:p>
@@ -37,7 +37,7 @@
           <w:color w:val="595959"/>
           <w:sz w:val="24"/>
         </w:rPr>
-        <w:t>A probability and statistics study using Bayes' theorem and Multinomial Naive Bayes</w:t>
+        <w:t>An Empirical Study of Random Variables, Bayes' Theorem, and Multinomial Naive Bayes</w:t>
       </w:r>
     </w:p>
     <w:p>
@@ -6666,7 +6666,7 @@
         <w:color w:val="808080"/>
         <w:sz w:val="17"/>
       </w:rPr>
-      <w:t>BAMAT207 | Probability and Statistics | Probabilistic SMS Spam Detection</w:t>
+      <w:t>BAMAT207 | Beyond the Words: A Probabilistic &amp; Bayesian Approach to SMS Spam Detection</w:t>
     </w:r>
   </w:p>
 </w:hdr>

</xml_diff>